<commit_message>
generate docs and PDF for Version 3
</commit_message>
<xml_diff>
--- a/new_page/final_revision/version_3/thesis.docx
+++ b/new_page/final_revision/version_3/thesis.docx
@@ -12785,7 +12785,7 @@
         <w:pStyle w:val="Bibliography"/>
       </w:pPr>
       <w:r>
-        <w:t xml:space="preserve">Nehodenko, Kostiantyn Bezverkhyi AND Iryna Parasii-Verhunenko AND Олександр Юрченко AND Olena Hryhorevska AND Yevhen Nesenіuk AND Viktoria. 2025.</w:t>
+        <w:t xml:space="preserve">Nehodenko, Kostiantyn Bezverkhyi AND Iryna Parasii-Verhunenko AND Oleksandr Yurchenko AND Olena Hryhorevska AND Yevhen Neseniuk AND Viktoria. 2025.</w:t>
       </w:r>
       <w:r>
         <w:t xml:space="preserve"> </w:t>
@@ -13273,7 +13273,7 @@
         <w:t xml:space="preserve"> </w:t>
       </w:r>
       <w:r>
-        <w:t xml:space="preserve">“��Siren’s Song in the AI Ocean: A Survey on Hallucination in Large Language Models,”</w:t>
+        <w:t xml:space="preserve">“Siren’s Song in the AI Ocean: A Survey on Hallucination in Large Language Models,”</w:t>
       </w:r>
       <w:r>
         <w:t xml:space="preserve"> </w:t>

</xml_diff>